<commit_message>
agora tem o gerar e upload de contrato
</commit_message>
<xml_diff>
--- a/MVP/app/uploads_temp/comprovante_retirada_4.docx
+++ b/MVP/app/uploads_temp/comprovante_retirada_4.docx
@@ -17,17 +17,17 @@
     </w:p>
     <w:p>
       <w:r>
-        <w:t>Data do Evento: 2025-07-02</w:t>
+        <w:t>Data do Evento: Não informada</w:t>
       </w:r>
     </w:p>
     <w:p>
       <w:r>
-        <w:t>Local do Evento: BUFFET MINHA CASA</w:t>
+        <w:t>Local do Evento: Não informado</w:t>
       </w:r>
     </w:p>
     <w:p>
       <w:r>
-        <w:t>Data de Emissão: 18/10/2025</w:t>
+        <w:t>Data de Emissão: 27/09/2025</w:t>
       </w:r>
     </w:p>
     <w:p>
@@ -346,7 +346,7 @@
     <w:p>
       <w:r>
         <w:br/>
-        <w:t>Valor Total do Pedido: R$ 373,50</w:t>
+        <w:t>Valor Total do Pedido: R$ Não encontrado</w:t>
       </w:r>
     </w:p>
     <w:p>

</xml_diff>